<commit_message>
Make bold detection case insensitive
</commit_message>
<xml_diff>
--- a/recipe_new.docx
+++ b/recipe_new.docx
@@ -124,7 +124,9 @@
     </w:p>
     <w:p>
       <w:r>
-        <w:t xml:space="preserve">Alex Demian</w:t>
+        <w:t xml:space="preserve">Alex Demian
+12529 Rathausgasse 19
+12529 Schönefeld bei Berlin</w:t>
       </w:r>
     </w:p>
     <w:p>
@@ -604,7 +606,9 @@
     </w:p>
     <w:p>
       <w:r>
-        <w:t xml:space="preserve">Alex Demian</w:t>
+        <w:t xml:space="preserve">Alex Demian
+12529 Rathausgasse 19
+12529 Schönefeld bei Berlin</w:t>
       </w:r>
     </w:p>
     <w:p>

</xml_diff>

<commit_message>
Refactor: Add text merging to handle broken PDF text splitting
</commit_message>
<xml_diff>
--- a/recipe_new.docx
+++ b/recipe_new.docx
@@ -124,9 +124,7 @@
     </w:p>
     <w:p>
       <w:r>
-        <w:t xml:space="preserve">Alex Demian
-12529 Rathausgasse 19
-12529 Schönefeld bei Berlin</w:t>
+        <w:t xml:space="preserve">Alex Demian</w:t>
       </w:r>
     </w:p>
     <w:p>
@@ -236,17 +234,17 @@
     </w:p>
     <w:p>
       <w:r>
-        <w:t xml:space="preserve">1</w:t>
-      </w:r>
-    </w:p>
-    <w:p>
-      <w:r>
-        <w:t xml:space="preserve">.201</w:t>
-      </w:r>
-    </w:p>
-    <w:p>
-      <w:r>
-        <w:t xml:space="preserve">8</w:t>
+        <w:t xml:space="preserve">5</w:t>
+      </w:r>
+    </w:p>
+    <w:p>
+      <w:r>
+        <w:t xml:space="preserve">.202</w:t>
+      </w:r>
+    </w:p>
+    <w:p>
+      <w:r>
+        <w:t xml:space="preserve">6</w:t>
       </w:r>
     </w:p>
     <w:p>
@@ -261,7 +259,7 @@
     </w:p>
     <w:p>
       <w:r>
-        <w:t xml:space="preserve">8</w:t>
+        <w:t xml:space="preserve">6</w:t>
       </w:r>
     </w:p>
     <w:p>
@@ -606,9 +604,7 @@
     </w:p>
     <w:p>
       <w:r>
-        <w:t xml:space="preserve">Alex Demian
-12529 Rathausgasse 19
-12529 Schönefeld bei Berlin</w:t>
+        <w:t xml:space="preserve">Alex Demian</w:t>
       </w:r>
     </w:p>
     <w:p>

</xml_diff>